<commit_message>
Changed configurations to allow local network requests
</commit_message>
<xml_diff>
--- a/David_Cogbill_CapstoneProject_TechFoundry_June2026.docx
+++ b/David_Cogbill_CapstoneProject_TechFoundry_June2026.docx
@@ -1490,13 +1490,16 @@
     </w:p>
     <w:p>
       <w:r>
-        <w:t>Install Node.js</w:t>
-      </w:r>
-    </w:p>
-    <w:p>
-      <w:r>
-        <w:t>Install mongodb</w:t>
-      </w:r>
+        <w:t xml:space="preserve">GitHub repository: </w:t>
+      </w:r>
+      <w:hyperlink r:id="rId11" w:history="1">
+        <w:r>
+          <w:rPr>
+            <w:rStyle w:val="Hyperlink"/>
+          </w:rPr>
+          <w:t>https://github.com/dlcogbilltech/TechLaunchCapstone</w:t>
+        </w:r>
+      </w:hyperlink>
     </w:p>
     <w:p>
       <w:pPr>
@@ -1541,10 +1544,13 @@
         <w:t>content has a title, description,</w:t>
       </w:r>
       <w:r>
-        <w:t xml:space="preserve"> the file name, the filename of the thumb nail it uses </w:t>
-      </w:r>
-      <w:r>
-        <w:t>, a list of user ids of likes, and a list of comments with a</w:t>
+        <w:t xml:space="preserve"> the file name, the filename of the thumb nail it </w:t>
+      </w:r>
+      <w:r>
+        <w:t>uses,</w:t>
+      </w:r>
+      <w:r>
+        <w:t xml:space="preserve"> a list of user ids of likes, and a list of comments with a</w:t>
       </w:r>
       <w:r>
         <w:t xml:space="preserve"> user id as the author and comment to go with it</w:t>
@@ -1587,7 +1593,7 @@
                     </pic:cNvPicPr>
                   </pic:nvPicPr>
                   <pic:blipFill>
-                    <a:blip r:embed="rId11" cstate="print">
+                    <a:blip r:embed="rId12" cstate="print">
                       <a:extLst>
                         <a:ext uri="{28A0092B-C50C-407E-A947-70E740481C1C}">
                           <a14:useLocalDpi xmlns:a14="http://schemas.microsoft.com/office/drawing/2010/main" val="0"/>
@@ -2219,7 +2225,7 @@
                     <pic:cNvPicPr/>
                   </pic:nvPicPr>
                   <pic:blipFill>
-                    <a:blip r:embed="rId12"/>
+                    <a:blip r:embed="rId13"/>
                     <a:stretch>
                       <a:fillRect/>
                     </a:stretch>
@@ -5094,7 +5100,7 @@
         </w:rPr>
         <w:t xml:space="preserve"> </w:t>
       </w:r>
-      <w:hyperlink r:id="rId13" w:history="1">
+      <w:hyperlink r:id="rId14" w:history="1">
         <w:r>
           <w:rPr>
             <w:rStyle w:val="Hyperlink"/>
@@ -5674,33 +5680,44 @@
       </w:r>
     </w:p>
     <w:p>
-      <w:pPr>
+      <w:r>
+        <w:t>echo "</w:t>
+      </w:r>
+      <w:r>
         <w:rPr>
           <w:lang w:val="en-US"/>
         </w:rPr>
-      </w:pPr>
-      <w:r>
-        <w:t>echo "</w:t>
+        <w:t xml:space="preserve"> </w:t>
       </w:r>
       <w:r>
         <w:rPr>
           <w:lang w:val="en-US"/>
         </w:rPr>
-        <w:t xml:space="preserve"> </w:t>
-      </w:r>
-      <w:r>
-        <w:rPr>
-          <w:lang w:val="en-US"/>
-        </w:rPr>
         <w:t>pineapples</w:t>
       </w:r>
       <w:r>
         <w:t>" &gt; db_password.txt</w:t>
+      </w:r>
+    </w:p>
+    <w:p>
+      <w:pPr>
+        <w:pStyle w:val="Heading1"/>
+      </w:pPr>
+      <w:r>
+        <w:t xml:space="preserve">Updating Project </w:t>
+      </w:r>
+      <w:r>
+        <w:t>Code</w:t>
+      </w:r>
+    </w:p>
+    <w:p>
+      <w:r>
+        <w:t>git add. ()</w:t>
       </w:r>
     </w:p>
     <w:sectPr>
-      <w:headerReference w:type="default" r:id="rId14"/>
-      <w:footerReference w:type="default" r:id="rId15"/>
+      <w:headerReference w:type="default" r:id="rId15"/>
+      <w:footerReference w:type="default" r:id="rId16"/>
       <w:pgSz w:w="12240" w:h="15840"/>
       <w:pgMar w:top="1440" w:right="1440" w:bottom="1440" w:left="1440" w:header="720" w:footer="720" w:gutter="0"/>
       <w:pgNumType w:start="0"/>

</xml_diff>